<commit_message>
Fix Word compatibility for all practical reports
Rebuild reports from the reference documents while preserving Word XML metadata.

Co-authored-by: Copilot <223556219+Copilot@users.noreply.github.com>
</commit_message>
<xml_diff>
--- a/practical-1/pract-1-awdf-24cs019.docx
+++ b/practical-1/pract-1-awdf-24cs019.docx
@@ -1,6 +1,6 @@
 
 <file path=word/document.xml><?xml version="1.0" encoding="utf-8"?>
-<w:document xmlns:a="http://schemas.openxmlformats.org/drawingml/2006/main" xmlns:mc="http://schemas.openxmlformats.org/markup-compatibility/2006" xmlns:pic="http://schemas.openxmlformats.org/drawingml/2006/picture" xmlns:r="http://schemas.openxmlformats.org/officeDocument/2006/relationships" xmlns:v="urn:schemas-microsoft-com:vml" xmlns:w="http://schemas.openxmlformats.org/wordprocessingml/2006/main" xmlns:w10="urn:schemas-microsoft-com:office:word" xmlns:w14="http://schemas.microsoft.com/office/word/2010/wordml" xmlns:wp="http://schemas.openxmlformats.org/drawingml/2006/wordprocessingDrawing" xmlns:wp14="http://schemas.microsoft.com/office/word/2010/wordprocessingDrawing" xmlns:wpg="http://schemas.microsoft.com/office/word/2010/wordprocessingGroup" xmlns:wps="http://schemas.microsoft.com/office/word/2010/wordprocessingShape" mc:Ignorable="w14 w15 w16se w16cid w16 w16cex w16sdtdh w16sdtfl w16du wp14">
+<w:document xmlns:wpc="http://schemas.microsoft.com/office/word/2010/wordprocessingCanvas" xmlns:cx="http://schemas.microsoft.com/office/drawing/2014/chartex" xmlns:cx1="http://schemas.microsoft.com/office/drawing/2015/9/8/chartex" xmlns:cx2="http://schemas.microsoft.com/office/drawing/2015/10/21/chartex" xmlns:cx3="http://schemas.microsoft.com/office/drawing/2016/5/9/chartex" xmlns:cx4="http://schemas.microsoft.com/office/drawing/2016/5/10/chartex" xmlns:cx5="http://schemas.microsoft.com/office/drawing/2016/5/11/chartex" xmlns:cx6="http://schemas.microsoft.com/office/drawing/2016/5/12/chartex" xmlns:cx7="http://schemas.microsoft.com/office/drawing/2016/5/13/chartex" xmlns:cx8="http://schemas.microsoft.com/office/drawing/2016/5/14/chartex" xmlns:mc="http://schemas.openxmlformats.org/markup-compatibility/2006" xmlns:aink="http://schemas.microsoft.com/office/drawing/2016/ink" xmlns:am3d="http://schemas.microsoft.com/office/drawing/2017/model3d" xmlns:o="urn:schemas-microsoft-com:office:office" xmlns:oel="http://schemas.microsoft.com/office/2019/extlst" xmlns:r="http://schemas.openxmlformats.org/officeDocument/2006/relationships" xmlns:m="http://schemas.openxmlformats.org/officeDocument/2006/math" xmlns:v="urn:schemas-microsoft-com:vml" xmlns:wp14="http://schemas.microsoft.com/office/word/2010/wordprocessingDrawing" xmlns:wp="http://schemas.openxmlformats.org/drawingml/2006/wordprocessingDrawing" xmlns:w10="urn:schemas-microsoft-com:office:word" xmlns:w="http://schemas.openxmlformats.org/wordprocessingml/2006/main" xmlns:w14="http://schemas.microsoft.com/office/word/2010/wordml" xmlns:w15="http://schemas.microsoft.com/office/word/2012/wordml" xmlns:w16cex="http://schemas.microsoft.com/office/word/2018/wordml/cex" xmlns:w16cid="http://schemas.microsoft.com/office/word/2016/wordml/cid" xmlns:w16="http://schemas.microsoft.com/office/word/2018/wordml" xmlns:w16du="http://schemas.microsoft.com/office/word/2023/wordml/word16du" xmlns:w16sdtdh="http://schemas.microsoft.com/office/word/2020/wordml/sdtdatahash" xmlns:w16sdtfl="http://schemas.microsoft.com/office/word/2024/wordml/sdtformatlock" xmlns:w16se="http://schemas.microsoft.com/office/word/2015/wordml/symex" xmlns:wpg="http://schemas.microsoft.com/office/word/2010/wordprocessingGroup" xmlns:wpi="http://schemas.microsoft.com/office/word/2010/wordprocessingInk" xmlns:wne="http://schemas.microsoft.com/office/word/2006/wordml" xmlns:wps="http://schemas.microsoft.com/office/word/2010/wordprocessingShape" mc:Ignorable="w14 w15 w16se w16cid w16 w16cex w16sdtdh w16sdtfl w16du wp14">
   <w:body>
     <w:p>
       <w:pPr>
@@ -29,7 +29,7 @@
                 <wp:wrapTopAndBottom/>
                 <wp:docPr id="1295" name="Group 1295"/>
                 <wp:cNvGraphicFramePr/>
-                <a:graphic>
+                <a:graphic xmlns:a="http://schemas.openxmlformats.org/drawingml/2006/main">
                   <a:graphicData uri="http://schemas.microsoft.com/office/word/2010/wordprocessingGroup">
                     <wpg:wgp>
                       <wpg:cNvGrpSpPr/>
@@ -101,7 +101,7 @@
               </wp:anchor>
             </w:drawing>
           </mc:Choice>
-          <mc:Fallback>
+          <mc:Fallback xmlns:a="http://schemas.openxmlformats.org/drawingml/2006/main">
             <w:pict>
               <v:group id="Group 1295" style="width:517.7pt;height:2.88pt;position:absolute;mso-position-horizontal-relative:page;mso-position-horizontal:absolute;margin-left:54pt;mso-position-vertical-relative:page;margin-top:725.25pt;" coordsize="65747,365">
                 <v:shape id="Shape 1399" style="position:absolute;width:65747;height:365;left:0;top:0;" coordsize="6574790,36576" path="m0,0l6574790,0l6574790,36576l0,36576l0,0">
@@ -159,298 +159,6 @@
         </w:tblCellMar>
         <w:tblLook w:val="04A0" w:firstRow="1" w:lastRow="0" w:firstColumn="1" w:lastColumn="0" w:noHBand="0" w:noVBand="1"/>
       </w:tblPr>
-      <w:tr>
-        <w:trPr>
-          <w:gridAfter w:val="1"/>
-          <w:wAfter w:w="525" w:type="dxa"/>
-          <w:trHeight w:val="295"/>
-        </w:trPr>
-        <w:tc>
-          <w:tcPr>
-            <w:tcW w:w="1965" w:type="dxa"/>
-            <w:tcBorders>
-              <w:top w:val="single" w:sz="4" w:space="0" w:color="000000"/>
-              <w:left w:val="single" w:sz="4" w:space="0" w:color="000000"/>
-              <w:bottom w:val="single" w:sz="4" w:space="0" w:color="000000"/>
-              <w:right w:val="single" w:sz="4" w:space="0" w:color="000000"/>
-            </w:tcBorders>
-          </w:tcPr>
-          <w:p>
-            <w:pPr>
-              <w:spacing w:after="0"/>
-              <w:ind w:left="1"/>
-            </w:pPr>
-            <w:r>
-              <w:rPr>
-                <w:rFonts w:ascii="Times New Roman" w:eastAsia="Times New Roman" w:hAnsi="Times New Roman" w:cs="Times New Roman"/>
-                <w:sz w:val="24"/>
-              </w:rPr>
-              <w:t xml:space="preserve">Email :</w:t>
-            </w:r>
-            <w:proofErr w:type="gramStart"/>
-            <w:r>
-              <w:rPr>
-                <w:rFonts w:ascii="Times New Roman" w:eastAsia="Times New Roman" w:hAnsi="Times New Roman" w:cs="Times New Roman"/>
-                <w:sz w:val="24"/>
-              </w:rPr>
-              <w:t/>
-            </w:r>
-            <w:proofErr w:type="gramEnd"/>
-          </w:p>
-        </w:tc>
-        <w:tc>
-          <w:tcPr>
-            <w:tcW w:w="2423" w:type="dxa"/>
-            <w:tcBorders>
-              <w:top w:val="single" w:sz="4" w:space="0" w:color="000000"/>
-              <w:left w:val="single" w:sz="4" w:space="0" w:color="000000"/>
-              <w:bottom w:val="single" w:sz="4" w:space="0" w:color="000000"/>
-              <w:right w:val="single" w:sz="4" w:space="0" w:color="000000"/>
-            </w:tcBorders>
-          </w:tcPr>
-          <w:p>
-            <w:pPr>
-              <w:spacing w:after="0"/>
-              <w:ind w:left="2"/>
-            </w:pPr>
-            <w:r>
-              <w:rPr>
-                <w:rFonts w:ascii="Times New Roman" w:eastAsia="Times New Roman" w:hAnsi="Times New Roman" w:cs="Times New Roman"/>
-                <w:b/>
-                <w:sz w:val="24"/>
-              </w:rPr>
-              <w:t>24cs019@charusat.edu.in</w:t>
-            </w:r>
-          </w:p>
-        </w:tc>
-        <w:tc>
-          <w:tcPr>
-            <w:tcW w:w="1672" w:type="dxa"/>
-            <w:tcBorders>
-              <w:top w:val="single" w:sz="4" w:space="0" w:color="000000"/>
-              <w:left w:val="single" w:sz="4" w:space="0" w:color="000000"/>
-              <w:bottom w:val="single" w:sz="4" w:space="0" w:color="000000"/>
-              <w:right w:val="single" w:sz="4" w:space="0" w:color="000000"/>
-            </w:tcBorders>
-          </w:tcPr>
-          <w:p>
-            <w:pPr>
-              <w:spacing w:after="0"/>
-            </w:pPr>
-            <w:r>
-              <w:rPr>
-                <w:rFonts w:ascii="Times New Roman" w:eastAsia="Times New Roman" w:hAnsi="Times New Roman" w:cs="Times New Roman"/>
-                <w:sz w:val="24"/>
-              </w:rPr>
-              <w:t>Semester :</w:t>
-            </w:r>
-          </w:p>
-        </w:tc>
-        <w:tc>
-          <w:tcPr>
-            <w:tcW w:w="2415" w:type="dxa"/>
-            <w:gridSpan w:val="2"/>
-            <w:tcBorders>
-              <w:top w:val="single" w:sz="4" w:space="0" w:color="000000"/>
-              <w:left w:val="single" w:sz="4" w:space="0" w:color="000000"/>
-              <w:bottom w:val="single" w:sz="4" w:space="0" w:color="000000"/>
-              <w:right w:val="nil"/>
-            </w:tcBorders>
-          </w:tcPr>
-          <w:p>
-            <w:pPr>
-              <w:spacing w:after="0"/>
-              <w:ind w:left="1"/>
-            </w:pPr>
-            <w:r>
-              <w:rPr>
-                <w:rFonts w:ascii="Times New Roman" w:eastAsia="Times New Roman" w:hAnsi="Times New Roman" w:cs="Times New Roman"/>
-                <w:b/>
-                <w:sz w:val="24"/>
-              </w:rPr>
-              <w:t>5th</w:t>
-            </w:r>
-          </w:p>
-        </w:tc>
-        <w:tc>
-          <w:tcPr>
-            <w:tcW w:w="255" w:type="dxa"/>
-            <w:tcBorders>
-              <w:top w:val="single" w:sz="4" w:space="0" w:color="000000"/>
-              <w:left w:val="nil"/>
-              <w:bottom w:val="single" w:sz="4" w:space="0" w:color="000000"/>
-              <w:right w:val="nil"/>
-            </w:tcBorders>
-          </w:tcPr>
-          <w:p>
-            <w:r>
-              <w:t/>
-            </w:r>
-          </w:p>
-        </w:tc>
-        <w:tc>
-          <w:tcPr>
-            <w:tcW w:w="1275" w:type="dxa"/>
-            <w:tcBorders>
-              <w:top w:val="single" w:sz="4" w:space="0" w:color="000000"/>
-              <w:left w:val="nil"/>
-              <w:bottom w:val="single" w:sz="4" w:space="0" w:color="000000"/>
-              <w:right w:val="single" w:sz="4" w:space="0" w:color="000000"/>
-            </w:tcBorders>
-          </w:tcPr>
-          <w:p>
-            <w:r>
-              <w:t/>
-            </w:r>
-          </w:p>
-        </w:tc>
-      </w:tr>
-      <w:tr>
-        <w:trPr>
-          <w:gridAfter w:val="1"/>
-          <w:wAfter w:w="525" w:type="dxa"/>
-          <w:trHeight w:val="295"/>
-        </w:trPr>
-        <w:tc>
-          <w:tcPr>
-            <w:tcW w:w="1965" w:type="dxa"/>
-            <w:tcBorders>
-              <w:top w:val="single" w:sz="4" w:space="0" w:color="000000"/>
-              <w:left w:val="single" w:sz="4" w:space="0" w:color="000000"/>
-              <w:bottom w:val="single" w:sz="4" w:space="0" w:color="000000"/>
-              <w:right w:val="single" w:sz="4" w:space="0" w:color="000000"/>
-            </w:tcBorders>
-          </w:tcPr>
-          <w:p>
-            <w:pPr>
-              <w:spacing w:after="0"/>
-              <w:ind w:left="1"/>
-            </w:pPr>
-            <w:r>
-              <w:rPr>
-                <w:rFonts w:ascii="Times New Roman" w:eastAsia="Times New Roman" w:hAnsi="Times New Roman" w:cs="Times New Roman"/>
-                <w:sz w:val="24"/>
-              </w:rPr>
-              <w:t xml:space="preserve">Degree :</w:t>
-            </w:r>
-            <w:proofErr w:type="gramStart"/>
-            <w:r>
-              <w:rPr>
-                <w:rFonts w:ascii="Times New Roman" w:eastAsia="Times New Roman" w:hAnsi="Times New Roman" w:cs="Times New Roman"/>
-                <w:sz w:val="24"/>
-              </w:rPr>
-              <w:t/>
-            </w:r>
-            <w:proofErr w:type="gramEnd"/>
-          </w:p>
-        </w:tc>
-        <w:tc>
-          <w:tcPr>
-            <w:tcW w:w="2423" w:type="dxa"/>
-            <w:tcBorders>
-              <w:top w:val="single" w:sz="4" w:space="0" w:color="000000"/>
-              <w:left w:val="single" w:sz="4" w:space="0" w:color="000000"/>
-              <w:bottom w:val="single" w:sz="4" w:space="0" w:color="000000"/>
-              <w:right w:val="single" w:sz="4" w:space="0" w:color="000000"/>
-            </w:tcBorders>
-          </w:tcPr>
-          <w:p>
-            <w:pPr>
-              <w:spacing w:after="0"/>
-              <w:ind w:left="2"/>
-            </w:pPr>
-            <w:r>
-              <w:rPr>
-                <w:rFonts w:ascii="Times New Roman" w:eastAsia="Times New Roman" w:hAnsi="Times New Roman" w:cs="Times New Roman"/>
-                <w:b/>
-                <w:sz w:val="24"/>
-              </w:rPr>
-              <w:t>B.Tech</w:t>
-            </w:r>
-          </w:p>
-        </w:tc>
-        <w:tc>
-          <w:tcPr>
-            <w:tcW w:w="1672" w:type="dxa"/>
-            <w:tcBorders>
-              <w:top w:val="single" w:sz="4" w:space="0" w:color="000000"/>
-              <w:left w:val="single" w:sz="4" w:space="0" w:color="000000"/>
-              <w:bottom w:val="single" w:sz="4" w:space="0" w:color="000000"/>
-              <w:right w:val="single" w:sz="4" w:space="0" w:color="000000"/>
-            </w:tcBorders>
-          </w:tcPr>
-          <w:p>
-            <w:pPr>
-              <w:spacing w:after="0"/>
-            </w:pPr>
-            <w:r>
-              <w:rPr>
-                <w:rFonts w:ascii="Times New Roman" w:eastAsia="Times New Roman" w:hAnsi="Times New Roman" w:cs="Times New Roman"/>
-                <w:sz w:val="24"/>
-              </w:rPr>
-              <w:t>Program :</w:t>
-            </w:r>
-          </w:p>
-        </w:tc>
-        <w:tc>
-          <w:tcPr>
-            <w:tcW w:w="2415" w:type="dxa"/>
-            <w:gridSpan w:val="2"/>
-            <w:tcBorders>
-              <w:top w:val="single" w:sz="4" w:space="0" w:color="000000"/>
-              <w:left w:val="single" w:sz="4" w:space="0" w:color="000000"/>
-              <w:bottom w:val="single" w:sz="4" w:space="0" w:color="000000"/>
-              <w:right w:val="nil"/>
-            </w:tcBorders>
-          </w:tcPr>
-          <w:p>
-            <w:pPr>
-              <w:spacing w:after="0"/>
-              <w:ind w:left="1"/>
-            </w:pPr>
-            <w:r>
-              <w:rPr>
-                <w:rFonts w:ascii="Times New Roman" w:eastAsia="Times New Roman" w:hAnsi="Times New Roman" w:cs="Times New Roman"/>
-                <w:b/>
-                <w:sz w:val="24"/>
-              </w:rPr>
-              <w:t>CSE-CSPIT</w:t>
-            </w:r>
-          </w:p>
-        </w:tc>
-        <w:tc>
-          <w:tcPr>
-            <w:tcW w:w="255" w:type="dxa"/>
-            <w:tcBorders>
-              <w:top w:val="single" w:sz="4" w:space="0" w:color="000000"/>
-              <w:left w:val="nil"/>
-              <w:bottom w:val="single" w:sz="4" w:space="0" w:color="000000"/>
-              <w:right w:val="nil"/>
-            </w:tcBorders>
-          </w:tcPr>
-          <w:p>
-            <w:r>
-              <w:t/>
-            </w:r>
-          </w:p>
-        </w:tc>
-        <w:tc>
-          <w:tcPr>
-            <w:tcW w:w="1275" w:type="dxa"/>
-            <w:tcBorders>
-              <w:top w:val="single" w:sz="4" w:space="0" w:color="000000"/>
-              <w:left w:val="nil"/>
-              <w:bottom w:val="single" w:sz="4" w:space="0" w:color="000000"/>
-              <w:right w:val="single" w:sz="4" w:space="0" w:color="000000"/>
-            </w:tcBorders>
-          </w:tcPr>
-          <w:p>
-            <w:r>
-              <w:t/>
-            </w:r>
-          </w:p>
-        </w:tc>
-      </w:tr>
       <w:tblGrid>
         <w:gridCol w:w="1965"/>
         <w:gridCol w:w="2423"/>
@@ -603,6 +311,282 @@
         <w:trPr>
           <w:gridAfter w:val="1"/>
           <w:wAfter w:w="525" w:type="dxa"/>
+          <w:trHeight w:val="295"/>
+        </w:trPr>
+        <w:tc>
+          <w:tcPr>
+            <w:tcW w:w="1965" w:type="dxa"/>
+            <w:tcBorders>
+              <w:top w:val="single" w:sz="4" w:space="0" w:color="000000"/>
+              <w:left w:val="single" w:sz="4" w:space="0" w:color="000000"/>
+              <w:bottom w:val="single" w:sz="4" w:space="0" w:color="000000"/>
+              <w:right w:val="single" w:sz="4" w:space="0" w:color="000000"/>
+            </w:tcBorders>
+          </w:tcPr>
+          <w:p>
+            <w:pPr>
+              <w:spacing w:after="0"/>
+              <w:ind w:left="1"/>
+            </w:pPr>
+            <w:r>
+              <w:rPr>
+                <w:rFonts w:ascii="Times New Roman" w:eastAsia="Times New Roman" w:hAnsi="Times New Roman" w:cs="Times New Roman"/>
+                <w:sz w:val="24"/>
+              </w:rPr>
+              <w:t xml:space="preserve">Email :</w:t>
+            </w:r>
+            <w:proofErr w:type="gramStart"/>
+            <w:r>
+              <w:rPr>
+                <w:rFonts w:ascii="Times New Roman" w:eastAsia="Times New Roman" w:hAnsi="Times New Roman" w:cs="Times New Roman"/>
+                <w:sz w:val="24"/>
+              </w:rPr>
+              <w:t/>
+            </w:r>
+            <w:proofErr w:type="gramEnd"/>
+          </w:p>
+        </w:tc>
+        <w:tc>
+          <w:tcPr>
+            <w:tcW w:w="2423" w:type="dxa"/>
+            <w:tcBorders>
+              <w:top w:val="single" w:sz="4" w:space="0" w:color="000000"/>
+              <w:left w:val="single" w:sz="4" w:space="0" w:color="000000"/>
+              <w:bottom w:val="single" w:sz="4" w:space="0" w:color="000000"/>
+              <w:right w:val="single" w:sz="4" w:space="0" w:color="000000"/>
+            </w:tcBorders>
+          </w:tcPr>
+          <w:p>
+            <w:pPr>
+              <w:spacing w:after="0"/>
+              <w:ind w:left="2"/>
+            </w:pPr>
+            <w:r>
+              <w:rPr>
+                <w:rFonts w:ascii="Times New Roman" w:eastAsia="Times New Roman" w:hAnsi="Times New Roman" w:cs="Times New Roman"/>
+                <w:b/>
+                <w:sz w:val="24"/>
+              </w:rPr>
+              <w:t>24cs019@charusat.edu.in</w:t>
+            </w:r>
+          </w:p>
+        </w:tc>
+        <w:tc>
+          <w:tcPr>
+            <w:tcW w:w="1672" w:type="dxa"/>
+            <w:tcBorders>
+              <w:top w:val="single" w:sz="4" w:space="0" w:color="000000"/>
+              <w:left w:val="single" w:sz="4" w:space="0" w:color="000000"/>
+              <w:bottom w:val="single" w:sz="4" w:space="0" w:color="000000"/>
+              <w:right w:val="single" w:sz="4" w:space="0" w:color="000000"/>
+            </w:tcBorders>
+          </w:tcPr>
+          <w:p>
+            <w:pPr>
+              <w:spacing w:after="0"/>
+            </w:pPr>
+            <w:r>
+              <w:rPr>
+                <w:rFonts w:ascii="Times New Roman" w:eastAsia="Times New Roman" w:hAnsi="Times New Roman" w:cs="Times New Roman"/>
+                <w:sz w:val="24"/>
+              </w:rPr>
+              <w:t>Semester :</w:t>
+            </w:r>
+          </w:p>
+        </w:tc>
+        <w:tc>
+          <w:tcPr>
+            <w:tcW w:w="2415" w:type="dxa"/>
+            <w:gridSpan w:val="2"/>
+            <w:tcBorders>
+              <w:top w:val="single" w:sz="4" w:space="0" w:color="000000"/>
+              <w:left w:val="single" w:sz="4" w:space="0" w:color="000000"/>
+              <w:bottom w:val="single" w:sz="4" w:space="0" w:color="000000"/>
+              <w:right w:val="nil"/>
+            </w:tcBorders>
+          </w:tcPr>
+          <w:p>
+            <w:pPr>
+              <w:spacing w:after="0"/>
+              <w:ind w:left="1"/>
+            </w:pPr>
+            <w:r>
+              <w:rPr>
+                <w:rFonts w:ascii="Times New Roman" w:eastAsia="Times New Roman" w:hAnsi="Times New Roman" w:cs="Times New Roman"/>
+                <w:b/>
+                <w:sz w:val="24"/>
+              </w:rPr>
+              <w:t>5th</w:t>
+            </w:r>
+          </w:p>
+        </w:tc>
+        <w:tc>
+          <w:tcPr>
+            <w:tcW w:w="255" w:type="dxa"/>
+            <w:tcBorders>
+              <w:top w:val="single" w:sz="4" w:space="0" w:color="000000"/>
+              <w:left w:val="nil"/>
+              <w:bottom w:val="single" w:sz="4" w:space="0" w:color="000000"/>
+              <w:right w:val="nil"/>
+            </w:tcBorders>
+          </w:tcPr>
+          <w:p/>
+        </w:tc>
+        <w:tc>
+          <w:tcPr>
+            <w:tcW w:w="1275" w:type="dxa"/>
+            <w:tcBorders>
+              <w:top w:val="single" w:sz="4" w:space="0" w:color="000000"/>
+              <w:left w:val="nil"/>
+              <w:bottom w:val="single" w:sz="4" w:space="0" w:color="000000"/>
+              <w:right w:val="single" w:sz="4" w:space="0" w:color="000000"/>
+            </w:tcBorders>
+          </w:tcPr>
+          <w:p/>
+        </w:tc>
+      </w:tr>
+      <w:tr>
+        <w:trPr>
+          <w:gridAfter w:val="1"/>
+          <w:wAfter w:w="525" w:type="dxa"/>
+          <w:trHeight w:val="295"/>
+        </w:trPr>
+        <w:tc>
+          <w:tcPr>
+            <w:tcW w:w="1965" w:type="dxa"/>
+            <w:tcBorders>
+              <w:top w:val="single" w:sz="4" w:space="0" w:color="000000"/>
+              <w:left w:val="single" w:sz="4" w:space="0" w:color="000000"/>
+              <w:bottom w:val="single" w:sz="4" w:space="0" w:color="000000"/>
+              <w:right w:val="single" w:sz="4" w:space="0" w:color="000000"/>
+            </w:tcBorders>
+          </w:tcPr>
+          <w:p>
+            <w:pPr>
+              <w:spacing w:after="0"/>
+              <w:ind w:left="1"/>
+            </w:pPr>
+            <w:r>
+              <w:rPr>
+                <w:rFonts w:ascii="Times New Roman" w:eastAsia="Times New Roman" w:hAnsi="Times New Roman" w:cs="Times New Roman"/>
+                <w:sz w:val="24"/>
+              </w:rPr>
+              <w:t xml:space="preserve">Degree :</w:t>
+            </w:r>
+            <w:proofErr w:type="gramStart"/>
+            <w:r>
+              <w:rPr>
+                <w:rFonts w:ascii="Times New Roman" w:eastAsia="Times New Roman" w:hAnsi="Times New Roman" w:cs="Times New Roman"/>
+                <w:sz w:val="24"/>
+              </w:rPr>
+              <w:t/>
+            </w:r>
+            <w:proofErr w:type="gramEnd"/>
+          </w:p>
+        </w:tc>
+        <w:tc>
+          <w:tcPr>
+            <w:tcW w:w="2423" w:type="dxa"/>
+            <w:tcBorders>
+              <w:top w:val="single" w:sz="4" w:space="0" w:color="000000"/>
+              <w:left w:val="single" w:sz="4" w:space="0" w:color="000000"/>
+              <w:bottom w:val="single" w:sz="4" w:space="0" w:color="000000"/>
+              <w:right w:val="single" w:sz="4" w:space="0" w:color="000000"/>
+            </w:tcBorders>
+          </w:tcPr>
+          <w:p>
+            <w:pPr>
+              <w:spacing w:after="0"/>
+              <w:ind w:left="2"/>
+            </w:pPr>
+            <w:r>
+              <w:rPr>
+                <w:rFonts w:ascii="Times New Roman" w:eastAsia="Times New Roman" w:hAnsi="Times New Roman" w:cs="Times New Roman"/>
+                <w:b/>
+                <w:sz w:val="24"/>
+              </w:rPr>
+              <w:t>B.Tech</w:t>
+            </w:r>
+          </w:p>
+        </w:tc>
+        <w:tc>
+          <w:tcPr>
+            <w:tcW w:w="1672" w:type="dxa"/>
+            <w:tcBorders>
+              <w:top w:val="single" w:sz="4" w:space="0" w:color="000000"/>
+              <w:left w:val="single" w:sz="4" w:space="0" w:color="000000"/>
+              <w:bottom w:val="single" w:sz="4" w:space="0" w:color="000000"/>
+              <w:right w:val="single" w:sz="4" w:space="0" w:color="000000"/>
+            </w:tcBorders>
+          </w:tcPr>
+          <w:p>
+            <w:pPr>
+              <w:spacing w:after="0"/>
+            </w:pPr>
+            <w:r>
+              <w:rPr>
+                <w:rFonts w:ascii="Times New Roman" w:eastAsia="Times New Roman" w:hAnsi="Times New Roman" w:cs="Times New Roman"/>
+                <w:sz w:val="24"/>
+              </w:rPr>
+              <w:t>Program :</w:t>
+            </w:r>
+          </w:p>
+        </w:tc>
+        <w:tc>
+          <w:tcPr>
+            <w:tcW w:w="2415" w:type="dxa"/>
+            <w:gridSpan w:val="2"/>
+            <w:tcBorders>
+              <w:top w:val="single" w:sz="4" w:space="0" w:color="000000"/>
+              <w:left w:val="single" w:sz="4" w:space="0" w:color="000000"/>
+              <w:bottom w:val="single" w:sz="4" w:space="0" w:color="000000"/>
+              <w:right w:val="nil"/>
+            </w:tcBorders>
+          </w:tcPr>
+          <w:p>
+            <w:pPr>
+              <w:spacing w:after="0"/>
+              <w:ind w:left="1"/>
+            </w:pPr>
+            <w:r>
+              <w:rPr>
+                <w:rFonts w:ascii="Times New Roman" w:eastAsia="Times New Roman" w:hAnsi="Times New Roman" w:cs="Times New Roman"/>
+                <w:b/>
+                <w:sz w:val="24"/>
+              </w:rPr>
+              <w:t>CSE-CSPIT</w:t>
+            </w:r>
+          </w:p>
+        </w:tc>
+        <w:tc>
+          <w:tcPr>
+            <w:tcW w:w="255" w:type="dxa"/>
+            <w:tcBorders>
+              <w:top w:val="single" w:sz="4" w:space="0" w:color="000000"/>
+              <w:left w:val="nil"/>
+              <w:bottom w:val="single" w:sz="4" w:space="0" w:color="000000"/>
+              <w:right w:val="nil"/>
+            </w:tcBorders>
+          </w:tcPr>
+          <w:p/>
+        </w:tc>
+        <w:tc>
+          <w:tcPr>
+            <w:tcW w:w="1275" w:type="dxa"/>
+            <w:tcBorders>
+              <w:top w:val="single" w:sz="4" w:space="0" w:color="000000"/>
+              <w:left w:val="nil"/>
+              <w:bottom w:val="single" w:sz="4" w:space="0" w:color="000000"/>
+              <w:right w:val="single" w:sz="4" w:space="0" w:color="000000"/>
+            </w:tcBorders>
+          </w:tcPr>
+          <w:p/>
+        </w:tc>
+      </w:tr>
+      <w:tr>
+        <w:trPr>
+          <w:gridAfter w:val="1"/>
+          <w:wAfter w:w="525" w:type="dxa"/>
           <w:trHeight w:val="562"/>
         </w:trPr>
         <w:tc>
@@ -985,7 +969,7 @@
                 <w:b/>
                 <w:sz w:val="24"/>
               </w:rPr>
-              <w:t>GitHub Link Repository Link: https://github.com/YugDholiya/AWDF/tree/main/practical-1</w:t>
+              <w:t>GitHub Link Repository Link: https://github.com/YugDholiya/24cs019-awdf-practical1</w:t>
             </w:r>
           </w:p>
         </w:tc>
@@ -1068,9 +1052,9 @@
                   <wp:effectExtent l="0" t="0" r="0" b="0"/>
                   <wp:docPr id="100" name="Picture 100"/>
                   <wp:cNvGraphicFramePr/>
-                  <a:graphic>
+                  <a:graphic xmlns:a="http://schemas.openxmlformats.org/drawingml/2006/main">
                     <a:graphicData uri="http://schemas.openxmlformats.org/drawingml/2006/picture">
-                      <pic:pic>
+                      <pic:pic xmlns:pic="http://schemas.openxmlformats.org/drawingml/2006/picture">
                         <pic:nvPicPr>
                           <pic:cNvPr id="100" name="Picture 100"/>
                           <pic:cNvPicPr/>
@@ -1151,7 +1135,7 @@
 </file>
 
 <file path=word/footer1.xml><?xml version="1.0" encoding="utf-8"?>
-<w:ftr xmlns:mc="http://schemas.openxmlformats.org/markup-compatibility/2006" xmlns:w="http://schemas.openxmlformats.org/wordprocessingml/2006/main" mc:Ignorable="w14 wp14">
+<w:ftr xmlns:m="http://schemas.openxmlformats.org/officeDocument/2006/math" xmlns:mc="http://schemas.openxmlformats.org/markup-compatibility/2006" xmlns:mo="http://schemas.microsoft.com/office/mac/office/2008/main" xmlns:mv="urn:schemas-microsoft-com:mac:vml" xmlns:o="urn:schemas-microsoft-com:office:office" xmlns:r="http://schemas.openxmlformats.org/officeDocument/2006/relationships" xmlns:v="urn:schemas-microsoft-com:vml" xmlns:w10="urn:schemas-microsoft-com:office:word" xmlns:w14="http://schemas.microsoft.com/office/word/2010/wordml" xmlns:w="http://schemas.openxmlformats.org/wordprocessingml/2006/main" xmlns:wne="http://schemas.microsoft.com/office/word/2006/wordml" xmlns:wp14="http://schemas.microsoft.com/office/word/2010/wordprocessingDrawing" xmlns:wp="http://schemas.openxmlformats.org/drawingml/2006/wordprocessingDrawing" xmlns:wpc="http://schemas.microsoft.com/office/word/2010/wordprocessingCanvas" xmlns:wpg="http://schemas.microsoft.com/office/word/2010/wordprocessingGroup" xmlns:wpi="http://schemas.microsoft.com/office/word/2010/wordprocessingInk" xmlns:wps="http://schemas.microsoft.com/office/word/2010/wordprocessingShape" mc:Ignorable="w14 wp14">
   <w:p>
     <w:pPr>
       <w:pStyle w:val="Footer"/>
@@ -1161,7 +1145,7 @@
 </file>
 
 <file path=word/header1.xml><?xml version="1.0" encoding="utf-8"?>
-<w:hdr xmlns:mc="http://schemas.openxmlformats.org/markup-compatibility/2006" xmlns:w="http://schemas.openxmlformats.org/wordprocessingml/2006/main" mc:Ignorable="w14 wp14">
+<w:hdr xmlns:m="http://schemas.openxmlformats.org/officeDocument/2006/math" xmlns:mc="http://schemas.openxmlformats.org/markup-compatibility/2006" xmlns:mo="http://schemas.microsoft.com/office/mac/office/2008/main" xmlns:mv="urn:schemas-microsoft-com:mac:vml" xmlns:o="urn:schemas-microsoft-com:office:office" xmlns:r="http://schemas.openxmlformats.org/officeDocument/2006/relationships" xmlns:v="urn:schemas-microsoft-com:vml" xmlns:w10="urn:schemas-microsoft-com:office:word" xmlns:w14="http://schemas.microsoft.com/office/word/2010/wordml" xmlns:w="http://schemas.openxmlformats.org/wordprocessingml/2006/main" xmlns:wne="http://schemas.microsoft.com/office/word/2006/wordml" xmlns:wp14="http://schemas.microsoft.com/office/word/2010/wordprocessingDrawing" xmlns:wp="http://schemas.openxmlformats.org/drawingml/2006/wordprocessingDrawing" xmlns:wpc="http://schemas.microsoft.com/office/word/2010/wordprocessingCanvas" xmlns:wpg="http://schemas.microsoft.com/office/word/2010/wordprocessingGroup" xmlns:wpi="http://schemas.microsoft.com/office/word/2010/wordprocessingInk" xmlns:wps="http://schemas.microsoft.com/office/word/2010/wordprocessingShape" mc:Ignorable="w14 wp14">
   <w:p>
     <w:pPr>
       <w:pStyle w:val="Header"/>
@@ -1171,7 +1155,7 @@
 </file>
 
 <file path=word/styles.xml><?xml version="1.0" encoding="utf-8"?>
-<w:styles xmlns:mc="http://schemas.openxmlformats.org/markup-compatibility/2006" xmlns:w="http://schemas.openxmlformats.org/wordprocessingml/2006/main" xmlns:w14="http://schemas.microsoft.com/office/word/2010/wordml" mc:Ignorable="w14 w15 w16se w16cid w16 w16cex w16sdtdh w16sdtfl w16du">
+<w:styles xmlns:mc="http://schemas.openxmlformats.org/markup-compatibility/2006" xmlns:r="http://schemas.openxmlformats.org/officeDocument/2006/relationships" xmlns:w="http://schemas.openxmlformats.org/wordprocessingml/2006/main" xmlns:w14="http://schemas.microsoft.com/office/word/2010/wordml" xmlns:w15="http://schemas.microsoft.com/office/word/2012/wordml" xmlns:w16cex="http://schemas.microsoft.com/office/word/2018/wordml/cex" xmlns:w16cid="http://schemas.microsoft.com/office/word/2016/wordml/cid" xmlns:w16="http://schemas.microsoft.com/office/word/2018/wordml" xmlns:w16du="http://schemas.microsoft.com/office/word/2023/wordml/word16du" xmlns:w16sdtdh="http://schemas.microsoft.com/office/word/2020/wordml/sdtdatahash" xmlns:w16sdtfl="http://schemas.microsoft.com/office/word/2024/wordml/sdtformatlock" xmlns:w16se="http://schemas.microsoft.com/office/word/2015/wordml/symex" mc:Ignorable="w14 w15 w16se w16cid w16 w16cex w16sdtdh w16sdtfl w16du">
   <w:docDefaults>
     <w:rPrDefault>
       <w:rPr>
@@ -1624,7 +1608,7 @@
 </file>
 
 <file path=word/theme/theme1.xml><?xml version="1.0" encoding="utf-8"?>
-<a:theme xmlns:a="http://schemas.openxmlformats.org/drawingml/2006/main" xmlns:thm15="http://schemas.microsoft.com/office/thememl/2012/main" name="Office Theme">
+<a:theme xmlns:a="http://schemas.openxmlformats.org/drawingml/2006/main" name="Office Theme">
   <a:themeElements>
     <a:clrScheme name="Office">
       <a:dk1>
@@ -1912,7 +1896,7 @@
   <a:extraClrSchemeLst/>
   <a:extLst>
     <a:ext uri="{05A4C25C-085E-4340-85A3-A5531E510DB2}">
-      <thm15:themeFamily name="Office Theme" id="{62F939B6-93AF-4DB8-9C6B-D6C7DFDC589F}" vid="{4A3C46E8-61CC-4603-A589-7422A47A8E4A}"/>
+      <thm15:themeFamily xmlns:thm15="http://schemas.microsoft.com/office/thememl/2012/main" name="Office Theme" id="{62F939B6-93AF-4DB8-9C6B-D6C7DFDC589F}" vid="{4A3C46E8-61CC-4603-A589-7422A47A8E4A}"/>
     </a:ext>
   </a:extLst>
 </a:theme>

</xml_diff>